<commit_message>
release: complete publication package and preprocessing record
</commit_message>
<xml_diff>
--- a/docs/VaaniQ_IEEE_Research_Paper_Draft.docx
+++ b/docs/VaaniQ_IEEE_Research_Paper_Draft.docx
@@ -1052,7 +1052,7 @@
       <w:r>
         <w:drawing>
           <wp:inline xmlns:a="http://schemas.openxmlformats.org/drawingml/2006/main" xmlns:pic="http://schemas.openxmlformats.org/drawingml/2006/picture">
-            <wp:extent cx="2907792" cy="1628364"/>
+            <wp:extent cx="2907792" cy="1575225"/>
             <wp:docPr id="1" name="Picture 1"/>
             <wp:cNvGraphicFramePr>
               <a:graphicFrameLocks noChangeAspect="1"/>
@@ -1073,7 +1073,7 @@
                   <pic:spPr>
                     <a:xfrm>
                       <a:off x="0" y="0"/>
-                      <a:ext cx="2907792" cy="1628364"/>
+                      <a:ext cx="2907792" cy="1575225"/>
                     </a:xfrm>
                     <a:prstGeom prst="rect"/>
                   </pic:spPr>
@@ -2069,7 +2069,7 @@
       <w:r>
         <w:drawing>
           <wp:inline xmlns:a="http://schemas.openxmlformats.org/drawingml/2006/main" xmlns:pic="http://schemas.openxmlformats.org/drawingml/2006/picture">
-            <wp:extent cx="2907792" cy="2460439"/>
+            <wp:extent cx="2907792" cy="2295626"/>
             <wp:docPr id="2" name="Picture 2"/>
             <wp:cNvGraphicFramePr>
               <a:graphicFrameLocks noChangeAspect="1"/>
@@ -2090,7 +2090,7 @@
                   <pic:spPr>
                     <a:xfrm>
                       <a:off x="0" y="0"/>
-                      <a:ext cx="2907792" cy="2460439"/>
+                      <a:ext cx="2907792" cy="2295626"/>
                     </a:xfrm>
                     <a:prstGeom prst="rect"/>
                   </pic:spPr>
@@ -2748,7 +2748,7 @@
       <w:r>
         <w:drawing>
           <wp:inline xmlns:a="http://schemas.openxmlformats.org/drawingml/2006/main" xmlns:pic="http://schemas.openxmlformats.org/drawingml/2006/picture">
-            <wp:extent cx="2907792" cy="1778885"/>
+            <wp:extent cx="2907792" cy="1286965"/>
             <wp:docPr id="3" name="Picture 3"/>
             <wp:cNvGraphicFramePr>
               <a:graphicFrameLocks noChangeAspect="1"/>
@@ -2769,7 +2769,7 @@
                   <pic:spPr>
                     <a:xfrm>
                       <a:off x="0" y="0"/>
-                      <a:ext cx="2907792" cy="1778885"/>
+                      <a:ext cx="2907792" cy="1286965"/>
                     </a:xfrm>
                     <a:prstGeom prst="rect"/>
                   </pic:spPr>
@@ -3470,7 +3470,7 @@
       <w:r>
         <w:drawing>
           <wp:inline xmlns:a="http://schemas.openxmlformats.org/drawingml/2006/main" xmlns:pic="http://schemas.openxmlformats.org/drawingml/2006/picture">
-            <wp:extent cx="2907792" cy="1680058"/>
+            <wp:extent cx="2907792" cy="1281423"/>
             <wp:docPr id="4" name="Picture 4"/>
             <wp:cNvGraphicFramePr>
               <a:graphicFrameLocks noChangeAspect="1"/>
@@ -3491,7 +3491,7 @@
                   <pic:spPr>
                     <a:xfrm>
                       <a:off x="0" y="0"/>
-                      <a:ext cx="2907792" cy="1680058"/>
+                      <a:ext cx="2907792" cy="1281423"/>
                     </a:xfrm>
                     <a:prstGeom prst="rect"/>
                   </pic:spPr>

</xml_diff>